<commit_message>
Changes in the documentation
</commit_message>
<xml_diff>
--- a/Documentation/Mid term Report/Mid term Report StockEase.docx
+++ b/Documentation/Mid term Report/Mid term Report StockEase.docx
@@ -709,6 +709,7 @@
       <w:bookmarkStart w:id="1" w:name="_Toc185189067"/>
       <w:bookmarkStart w:id="2" w:name="_Toc185235998"/>
       <w:bookmarkStart w:id="3" w:name="_Toc186315215"/>
+      <w:bookmarkStart w:id="4" w:name="_Toc186316278"/>
       <w:r>
         <w:rPr>
           <w:rStyle w:val="Heading1Char"/>
@@ -720,6 +721,7 @@
       <w:bookmarkEnd w:id="1"/>
       <w:bookmarkEnd w:id="2"/>
       <w:bookmarkEnd w:id="3"/>
+      <w:bookmarkEnd w:id="4"/>
     </w:p>
     <w:sdt>
       <w:sdtPr>
@@ -779,7 +781,8 @@
             </w:rPr>
             <w:fldChar w:fldCharType="separate"/>
           </w:r>
-          <w:hyperlink w:anchor="_Toc186315216" w:history="1">
+          <w:hyperlink w:anchor="_Toc186316278" w:history="1"/>
+          <w:hyperlink w:anchor="_Toc186316279" w:history="1">
             <w:r>
               <w:rPr>
                 <w:rStyle w:val="Hyperlink"/>
@@ -806,7 +809,7 @@
                 <w:noProof/>
                 <w:webHidden/>
               </w:rPr>
-              <w:instrText xml:space="preserve"> PAGEREF _Toc186315216 \h </w:instrText>
+              <w:instrText xml:space="preserve"> PAGEREF _Toc186316279 \h </w:instrText>
             </w:r>
             <w:r>
               <w:rPr>
@@ -827,6 +830,93 @@
                 <w:webHidden/>
               </w:rPr>
               <w:t>iii</w:t>
+            </w:r>
+            <w:r>
+              <w:rPr>
+                <w:noProof/>
+                <w:webHidden/>
+              </w:rPr>
+              <w:fldChar w:fldCharType="end"/>
+            </w:r>
+          </w:hyperlink>
+          <w:bookmarkStart w:id="5" w:name="_GoBack"/>
+          <w:bookmarkEnd w:id="5"/>
+        </w:p>
+        <w:p>
+          <w:pPr>
+            <w:pStyle w:val="TOC1"/>
+            <w:tabs>
+              <w:tab w:val="left" w:pos="440"/>
+            </w:tabs>
+            <w:rPr>
+              <w:rFonts w:asciiTheme="minorHAnsi" w:eastAsiaTheme="minorEastAsia" w:hAnsiTheme="minorHAnsi"/>
+              <w:noProof/>
+              <w:sz w:val="22"/>
+            </w:rPr>
+          </w:pPr>
+          <w:hyperlink w:anchor="_Toc186316280" w:history="1">
+            <w:r>
+              <w:rPr>
+                <w:rStyle w:val="Hyperlink"/>
+                <w:noProof/>
+              </w:rPr>
+              <w:t>1.</w:t>
+            </w:r>
+            <w:r>
+              <w:rPr>
+                <w:rFonts w:asciiTheme="minorHAnsi" w:eastAsiaTheme="minorEastAsia" w:hAnsiTheme="minorHAnsi"/>
+                <w:noProof/>
+                <w:sz w:val="22"/>
+              </w:rPr>
+              <w:tab/>
+            </w:r>
+            <w:r>
+              <w:rPr>
+                <w:rStyle w:val="Hyperlink"/>
+                <w:noProof/>
+              </w:rPr>
+              <w:t>Introduction</w:t>
+            </w:r>
+            <w:r>
+              <w:rPr>
+                <w:noProof/>
+                <w:webHidden/>
+              </w:rPr>
+              <w:tab/>
+            </w:r>
+            <w:r>
+              <w:rPr>
+                <w:noProof/>
+                <w:webHidden/>
+              </w:rPr>
+              <w:fldChar w:fldCharType="begin"/>
+            </w:r>
+            <w:r>
+              <w:rPr>
+                <w:noProof/>
+                <w:webHidden/>
+              </w:rPr>
+              <w:instrText xml:space="preserve"> PAGEREF _Toc186316280 \h </w:instrText>
+            </w:r>
+            <w:r>
+              <w:rPr>
+                <w:noProof/>
+                <w:webHidden/>
+              </w:rPr>
+            </w:r>
+            <w:r>
+              <w:rPr>
+                <w:noProof/>
+                <w:webHidden/>
+              </w:rPr>
+              <w:fldChar w:fldCharType="separate"/>
+            </w:r>
+            <w:r>
+              <w:rPr>
+                <w:noProof/>
+                <w:webHidden/>
+              </w:rPr>
+              <w:t>1</w:t>
             </w:r>
             <w:r>
               <w:rPr>
@@ -849,13 +939,13 @@
               <w:sz w:val="22"/>
             </w:rPr>
           </w:pPr>
-          <w:hyperlink w:anchor="_Toc186315217" w:history="1">
+          <w:hyperlink w:anchor="_Toc186316281" w:history="1">
             <w:r>
               <w:rPr>
                 <w:rStyle w:val="Hyperlink"/>
                 <w:noProof/>
               </w:rPr>
-              <w:t>1.</w:t>
+              <w:t>2.</w:t>
             </w:r>
             <w:r>
               <w:rPr>
@@ -870,7 +960,7 @@
                 <w:rStyle w:val="Hyperlink"/>
                 <w:noProof/>
               </w:rPr>
-              <w:t>Introduction</w:t>
+              <w:t>Problem Statement</w:t>
             </w:r>
             <w:r>
               <w:rPr>
@@ -891,7 +981,7 @@
                 <w:noProof/>
                 <w:webHidden/>
               </w:rPr>
-              <w:instrText xml:space="preserve"> PAGEREF _Toc186315217 \h </w:instrText>
+              <w:instrText xml:space="preserve"> PAGEREF _Toc186316281 \h </w:instrText>
             </w:r>
             <w:r>
               <w:rPr>
@@ -911,7 +1001,7 @@
                 <w:noProof/>
                 <w:webHidden/>
               </w:rPr>
-              <w:t>1</w:t>
+              <w:t>2</w:t>
             </w:r>
             <w:r>
               <w:rPr>
@@ -934,13 +1024,13 @@
               <w:sz w:val="22"/>
             </w:rPr>
           </w:pPr>
-          <w:hyperlink w:anchor="_Toc186315218" w:history="1">
+          <w:hyperlink w:anchor="_Toc186316282" w:history="1">
             <w:r>
               <w:rPr>
                 <w:rStyle w:val="Hyperlink"/>
                 <w:noProof/>
               </w:rPr>
-              <w:t>2.</w:t>
+              <w:t>3.</w:t>
             </w:r>
             <w:r>
               <w:rPr>
@@ -955,7 +1045,7 @@
                 <w:rStyle w:val="Hyperlink"/>
                 <w:noProof/>
               </w:rPr>
-              <w:t>Problem Statement</w:t>
+              <w:t>Objectives</w:t>
             </w:r>
             <w:r>
               <w:rPr>
@@ -976,7 +1066,7 @@
                 <w:noProof/>
                 <w:webHidden/>
               </w:rPr>
-              <w:instrText xml:space="preserve"> PAGEREF _Toc186315218 \h </w:instrText>
+              <w:instrText xml:space="preserve"> PAGEREF _Toc186316282 \h </w:instrText>
             </w:r>
             <w:r>
               <w:rPr>
@@ -996,7 +1086,7 @@
                 <w:noProof/>
                 <w:webHidden/>
               </w:rPr>
-              <w:t>2</w:t>
+              <w:t>3</w:t>
             </w:r>
             <w:r>
               <w:rPr>
@@ -1019,13 +1109,13 @@
               <w:sz w:val="22"/>
             </w:rPr>
           </w:pPr>
-          <w:hyperlink w:anchor="_Toc186315219" w:history="1">
+          <w:hyperlink w:anchor="_Toc186316283" w:history="1">
             <w:r>
               <w:rPr>
                 <w:rStyle w:val="Hyperlink"/>
                 <w:noProof/>
               </w:rPr>
-              <w:t>3.</w:t>
+              <w:t>4.</w:t>
             </w:r>
             <w:r>
               <w:rPr>
@@ -1040,7 +1130,7 @@
                 <w:rStyle w:val="Hyperlink"/>
                 <w:noProof/>
               </w:rPr>
-              <w:t>Objectives</w:t>
+              <w:t>Background Study</w:t>
             </w:r>
             <w:r>
               <w:rPr>
@@ -1061,7 +1151,7 @@
                 <w:noProof/>
                 <w:webHidden/>
               </w:rPr>
-              <w:instrText xml:space="preserve"> PAGEREF _Toc186315219 \h </w:instrText>
+              <w:instrText xml:space="preserve"> PAGEREF _Toc186316283 \h </w:instrText>
             </w:r>
             <w:r>
               <w:rPr>
@@ -1081,7 +1171,7 @@
                 <w:noProof/>
                 <w:webHidden/>
               </w:rPr>
-              <w:t>3</w:t>
+              <w:t>4</w:t>
             </w:r>
             <w:r>
               <w:rPr>
@@ -1104,13 +1194,13 @@
               <w:sz w:val="22"/>
             </w:rPr>
           </w:pPr>
-          <w:hyperlink w:anchor="_Toc186315220" w:history="1">
+          <w:hyperlink w:anchor="_Toc186316284" w:history="1">
             <w:r>
               <w:rPr>
                 <w:rStyle w:val="Hyperlink"/>
                 <w:noProof/>
               </w:rPr>
-              <w:t>4.</w:t>
+              <w:t>5.</w:t>
             </w:r>
             <w:r>
               <w:rPr>
@@ -1125,7 +1215,7 @@
                 <w:rStyle w:val="Hyperlink"/>
                 <w:noProof/>
               </w:rPr>
-              <w:t>Background Study</w:t>
+              <w:t>Methodology</w:t>
             </w:r>
             <w:r>
               <w:rPr>
@@ -1146,92 +1236,7 @@
                 <w:noProof/>
                 <w:webHidden/>
               </w:rPr>
-              <w:instrText xml:space="preserve"> PAGEREF _Toc186315220 \h </w:instrText>
-            </w:r>
-            <w:r>
-              <w:rPr>
-                <w:noProof/>
-                <w:webHidden/>
-              </w:rPr>
-            </w:r>
-            <w:r>
-              <w:rPr>
-                <w:noProof/>
-                <w:webHidden/>
-              </w:rPr>
-              <w:fldChar w:fldCharType="separate"/>
-            </w:r>
-            <w:r>
-              <w:rPr>
-                <w:noProof/>
-                <w:webHidden/>
-              </w:rPr>
-              <w:t>4</w:t>
-            </w:r>
-            <w:r>
-              <w:rPr>
-                <w:noProof/>
-                <w:webHidden/>
-              </w:rPr>
-              <w:fldChar w:fldCharType="end"/>
-            </w:r>
-          </w:hyperlink>
-        </w:p>
-        <w:p>
-          <w:pPr>
-            <w:pStyle w:val="TOC1"/>
-            <w:tabs>
-              <w:tab w:val="left" w:pos="440"/>
-            </w:tabs>
-            <w:rPr>
-              <w:rFonts w:asciiTheme="minorHAnsi" w:eastAsiaTheme="minorEastAsia" w:hAnsiTheme="minorHAnsi"/>
-              <w:noProof/>
-              <w:sz w:val="22"/>
-            </w:rPr>
-          </w:pPr>
-          <w:hyperlink w:anchor="_Toc186315221" w:history="1">
-            <w:r>
-              <w:rPr>
-                <w:rStyle w:val="Hyperlink"/>
-                <w:noProof/>
-              </w:rPr>
-              <w:t>5.</w:t>
-            </w:r>
-            <w:r>
-              <w:rPr>
-                <w:rFonts w:asciiTheme="minorHAnsi" w:eastAsiaTheme="minorEastAsia" w:hAnsiTheme="minorHAnsi"/>
-                <w:noProof/>
-                <w:sz w:val="22"/>
-              </w:rPr>
-              <w:tab/>
-            </w:r>
-            <w:r>
-              <w:rPr>
-                <w:rStyle w:val="Hyperlink"/>
-                <w:noProof/>
-              </w:rPr>
-              <w:t>Methodology</w:t>
-            </w:r>
-            <w:r>
-              <w:rPr>
-                <w:noProof/>
-                <w:webHidden/>
-              </w:rPr>
-              <w:tab/>
-            </w:r>
-            <w:r>
-              <w:rPr>
-                <w:noProof/>
-                <w:webHidden/>
-              </w:rPr>
-              <w:fldChar w:fldCharType="begin"/>
-            </w:r>
-            <w:r>
-              <w:rPr>
-                <w:noProof/>
-                <w:webHidden/>
-              </w:rPr>
-              <w:instrText xml:space="preserve"> PAGEREF _Toc186315221 \h </w:instrText>
+              <w:instrText xml:space="preserve"> PAGEREF _Toc186316284 \h </w:instrText>
             </w:r>
             <w:r>
               <w:rPr>
@@ -1271,7 +1276,7 @@
               <w:sz w:val="22"/>
             </w:rPr>
           </w:pPr>
-          <w:hyperlink w:anchor="_Toc186315222" w:history="1">
+          <w:hyperlink w:anchor="_Toc186316285" w:history="1">
             <w:r>
               <w:rPr>
                 <w:rStyle w:val="Hyperlink"/>
@@ -1298,7 +1303,7 @@
                 <w:noProof/>
                 <w:webHidden/>
               </w:rPr>
-              <w:instrText xml:space="preserve"> PAGEREF _Toc186315222 \h </w:instrText>
+              <w:instrText xml:space="preserve"> PAGEREF _Toc186316285 \h </w:instrText>
             </w:r>
             <w:r>
               <w:rPr>
@@ -1341,7 +1346,7 @@
               <w:sz w:val="22"/>
             </w:rPr>
           </w:pPr>
-          <w:hyperlink w:anchor="_Toc186315223" w:history="1">
+          <w:hyperlink w:anchor="_Toc186316286" w:history="1">
             <w:r>
               <w:rPr>
                 <w:rStyle w:val="Hyperlink"/>
@@ -1383,7 +1388,7 @@
                 <w:noProof/>
                 <w:webHidden/>
               </w:rPr>
-              <w:instrText xml:space="preserve"> PAGEREF _Toc186315223 \h </w:instrText>
+              <w:instrText xml:space="preserve"> PAGEREF _Toc186316286 \h </w:instrText>
             </w:r>
             <w:r>
               <w:rPr>
@@ -1426,7 +1431,7 @@
               <w:sz w:val="22"/>
             </w:rPr>
           </w:pPr>
-          <w:hyperlink w:anchor="_Toc186315224" w:history="1">
+          <w:hyperlink w:anchor="_Toc186316287" w:history="1">
             <w:r>
               <w:rPr>
                 <w:rStyle w:val="Hyperlink"/>
@@ -1468,7 +1473,7 @@
                 <w:noProof/>
                 <w:webHidden/>
               </w:rPr>
-              <w:instrText xml:space="preserve"> PAGEREF _Toc186315224 \h </w:instrText>
+              <w:instrText xml:space="preserve"> PAGEREF _Toc186316287 \h </w:instrText>
             </w:r>
             <w:r>
               <w:rPr>
@@ -1511,7 +1516,7 @@
               <w:sz w:val="22"/>
             </w:rPr>
           </w:pPr>
-          <w:hyperlink w:anchor="_Toc186315225" w:history="1">
+          <w:hyperlink w:anchor="_Toc186316288" w:history="1">
             <w:r>
               <w:rPr>
                 <w:rStyle w:val="Hyperlink"/>
@@ -1553,7 +1558,7 @@
                 <w:noProof/>
                 <w:webHidden/>
               </w:rPr>
-              <w:instrText xml:space="preserve"> PAGEREF _Toc186315225 \h </w:instrText>
+              <w:instrText xml:space="preserve"> PAGEREF _Toc186316288 \h </w:instrText>
             </w:r>
             <w:r>
               <w:rPr>
@@ -1593,13 +1598,13 @@
               <w:sz w:val="22"/>
             </w:rPr>
           </w:pPr>
-          <w:hyperlink w:anchor="_Toc186315226" w:history="1">
+          <w:hyperlink w:anchor="_Toc186316289" w:history="1">
             <w:r>
               <w:rPr>
                 <w:rStyle w:val="Hyperlink"/>
                 <w:noProof/>
               </w:rPr>
-              <w:t>7. Project Progress Report</w:t>
+              <w:t>7. Project Gantt Chart</w:t>
             </w:r>
             <w:r>
               <w:rPr>
@@ -1620,7 +1625,7 @@
                 <w:noProof/>
                 <w:webHidden/>
               </w:rPr>
-              <w:instrText xml:space="preserve"> PAGEREF _Toc186315226 \h </w:instrText>
+              <w:instrText xml:space="preserve"> PAGEREF _Toc186316289 \h </w:instrText>
             </w:r>
             <w:r>
               <w:rPr>
@@ -1641,6 +1646,73 @@
                 <w:webHidden/>
               </w:rPr>
               <w:t>8</w:t>
+            </w:r>
+            <w:r>
+              <w:rPr>
+                <w:noProof/>
+                <w:webHidden/>
+              </w:rPr>
+              <w:fldChar w:fldCharType="end"/>
+            </w:r>
+          </w:hyperlink>
+        </w:p>
+        <w:p>
+          <w:pPr>
+            <w:pStyle w:val="TOC1"/>
+            <w:rPr>
+              <w:rFonts w:asciiTheme="minorHAnsi" w:eastAsiaTheme="minorEastAsia" w:hAnsiTheme="minorHAnsi"/>
+              <w:noProof/>
+              <w:sz w:val="22"/>
+            </w:rPr>
+          </w:pPr>
+          <w:hyperlink w:anchor="_Toc186316290" w:history="1">
+            <w:r>
+              <w:rPr>
+                <w:rStyle w:val="Hyperlink"/>
+                <w:noProof/>
+              </w:rPr>
+              <w:t>8. Project Progress Report</w:t>
+            </w:r>
+            <w:r>
+              <w:rPr>
+                <w:noProof/>
+                <w:webHidden/>
+              </w:rPr>
+              <w:tab/>
+            </w:r>
+            <w:r>
+              <w:rPr>
+                <w:noProof/>
+                <w:webHidden/>
+              </w:rPr>
+              <w:fldChar w:fldCharType="begin"/>
+            </w:r>
+            <w:r>
+              <w:rPr>
+                <w:noProof/>
+                <w:webHidden/>
+              </w:rPr>
+              <w:instrText xml:space="preserve"> PAGEREF _Toc186316290 \h </w:instrText>
+            </w:r>
+            <w:r>
+              <w:rPr>
+                <w:noProof/>
+                <w:webHidden/>
+              </w:rPr>
+            </w:r>
+            <w:r>
+              <w:rPr>
+                <w:noProof/>
+                <w:webHidden/>
+              </w:rPr>
+              <w:fldChar w:fldCharType="separate"/>
+            </w:r>
+            <w:r>
+              <w:rPr>
+                <w:noProof/>
+                <w:webHidden/>
+              </w:rPr>
+              <w:t>9</w:t>
             </w:r>
             <w:r>
               <w:rPr>
@@ -1663,7 +1735,7 @@
               <w:sz w:val="22"/>
             </w:rPr>
           </w:pPr>
-          <w:hyperlink w:anchor="_Toc186315227" w:history="1">
+          <w:hyperlink w:anchor="_Toc186316291" w:history="1">
             <w:r>
               <w:rPr>
                 <w:rStyle w:val="Hyperlink"/>
@@ -1690,7 +1762,7 @@
                 <w:noProof/>
                 <w:webHidden/>
               </w:rPr>
-              <w:instrText xml:space="preserve"> PAGEREF _Toc186315227 \h </w:instrText>
+              <w:instrText xml:space="preserve"> PAGEREF _Toc186316291 \h </w:instrText>
             </w:r>
             <w:r>
               <w:rPr>
@@ -1710,7 +1782,7 @@
                 <w:noProof/>
                 <w:webHidden/>
               </w:rPr>
-              <w:t>8</w:t>
+              <w:t>9</w:t>
             </w:r>
             <w:r>
               <w:rPr>
@@ -1733,7 +1805,7 @@
               <w:sz w:val="22"/>
             </w:rPr>
           </w:pPr>
-          <w:hyperlink w:anchor="_Toc186315228" w:history="1">
+          <w:hyperlink w:anchor="_Toc186316292" w:history="1">
             <w:r>
               <w:rPr>
                 <w:rStyle w:val="Hyperlink"/>
@@ -1760,7 +1832,7 @@
                 <w:noProof/>
                 <w:webHidden/>
               </w:rPr>
-              <w:instrText xml:space="preserve"> PAGEREF _Toc186315228 \h </w:instrText>
+              <w:instrText xml:space="preserve"> PAGEREF _Toc186316292 \h </w:instrText>
             </w:r>
             <w:r>
               <w:rPr>
@@ -1780,7 +1852,7 @@
                 <w:noProof/>
                 <w:webHidden/>
               </w:rPr>
-              <w:t>8</w:t>
+              <w:t>9</w:t>
             </w:r>
             <w:r>
               <w:rPr>
@@ -1800,13 +1872,13 @@
               <w:sz w:val="22"/>
             </w:rPr>
           </w:pPr>
-          <w:hyperlink w:anchor="_Toc186315229" w:history="1">
+          <w:hyperlink w:anchor="_Toc186316293" w:history="1">
             <w:r>
               <w:rPr>
                 <w:rStyle w:val="Hyperlink"/>
                 <w:noProof/>
               </w:rPr>
-              <w:t>8. Conclusion</w:t>
+              <w:t>9. Conclusion</w:t>
             </w:r>
             <w:r>
               <w:rPr>
@@ -1827,7 +1899,7 @@
                 <w:noProof/>
                 <w:webHidden/>
               </w:rPr>
-              <w:instrText xml:space="preserve"> PAGEREF _Toc186315229 \h </w:instrText>
+              <w:instrText xml:space="preserve"> PAGEREF _Toc186316293 \h </w:instrText>
             </w:r>
             <w:r>
               <w:rPr>
@@ -1847,7 +1919,7 @@
                 <w:noProof/>
                 <w:webHidden/>
               </w:rPr>
-              <w:t>9</w:t>
+              <w:t>10</w:t>
             </w:r>
             <w:r>
               <w:rPr>
@@ -1867,13 +1939,13 @@
               <w:sz w:val="22"/>
             </w:rPr>
           </w:pPr>
-          <w:hyperlink w:anchor="_Toc186315230" w:history="1">
+          <w:hyperlink w:anchor="_Toc186316294" w:history="1">
             <w:r>
               <w:rPr>
                 <w:rStyle w:val="Hyperlink"/>
                 <w:noProof/>
               </w:rPr>
-              <w:t>9. References</w:t>
+              <w:t>10. References</w:t>
             </w:r>
             <w:r>
               <w:rPr>
@@ -1894,7 +1966,7 @@
                 <w:noProof/>
                 <w:webHidden/>
               </w:rPr>
-              <w:instrText xml:space="preserve"> PAGEREF _Toc186315230 \h </w:instrText>
+              <w:instrText xml:space="preserve"> PAGEREF _Toc186316294 \h </w:instrText>
             </w:r>
             <w:r>
               <w:rPr>
@@ -1914,7 +1986,7 @@
                 <w:noProof/>
                 <w:webHidden/>
               </w:rPr>
-              <w:t>10</w:t>
+              <w:t>11</w:t>
             </w:r>
             <w:r>
               <w:rPr>
@@ -1956,20 +2028,18 @@
       <w:r>
         <w:br w:type="page"/>
       </w:r>
-      <w:bookmarkStart w:id="4" w:name="_GoBack"/>
-      <w:bookmarkEnd w:id="4"/>
     </w:p>
     <w:p>
       <w:pPr>
         <w:pStyle w:val="Heading1"/>
         <w:jc w:val="center"/>
       </w:pPr>
-      <w:bookmarkStart w:id="5" w:name="_Toc186315216"/>
+      <w:bookmarkStart w:id="6" w:name="_Toc186316279"/>
       <w:r>
         <w:lastRenderedPageBreak/>
         <w:t>List of Figures</w:t>
       </w:r>
-      <w:bookmarkEnd w:id="5"/>
+      <w:bookmarkEnd w:id="6"/>
     </w:p>
     <w:p>
       <w:pPr>
@@ -1981,65 +2051,78 @@
           <w:noProof/>
         </w:rPr>
       </w:pPr>
-      <w:fldSimple w:instr=" TOC \h \z \c &quot;Fig 5.&quot; ">
-        <w:hyperlink r:id="rId9" w:anchor="_Toc182659508" w:history="1">
-          <w:r>
-            <w:rPr>
-              <w:rStyle w:val="Hyperlink"/>
-              <w:noProof/>
-            </w:rPr>
-            <w:t>Fig 5.1: Agile Methodology</w:t>
-          </w:r>
-          <w:r>
-            <w:rPr>
-              <w:noProof/>
-              <w:webHidden/>
-            </w:rPr>
-            <w:tab/>
-          </w:r>
-          <w:r>
-            <w:rPr>
-              <w:noProof/>
-              <w:webHidden/>
-            </w:rPr>
-            <w:fldChar w:fldCharType="begin"/>
-          </w:r>
-          <w:r>
-            <w:rPr>
-              <w:noProof/>
-              <w:webHidden/>
-            </w:rPr>
-            <w:instrText xml:space="preserve"> PAGEREF _Toc182659508 \h </w:instrText>
-          </w:r>
-          <w:r>
-            <w:rPr>
-              <w:noProof/>
-              <w:webHidden/>
-            </w:rPr>
-          </w:r>
-          <w:r>
-            <w:rPr>
-              <w:noProof/>
-              <w:webHidden/>
-            </w:rPr>
-            <w:fldChar w:fldCharType="separate"/>
-          </w:r>
-          <w:r>
-            <w:rPr>
-              <w:noProof/>
-              <w:webHidden/>
-            </w:rPr>
-            <w:t>5</w:t>
-          </w:r>
-          <w:r>
-            <w:rPr>
-              <w:noProof/>
-              <w:webHidden/>
-            </w:rPr>
-            <w:fldChar w:fldCharType="end"/>
-          </w:r>
-        </w:hyperlink>
-      </w:fldSimple>
+      <w:r>
+        <w:fldChar w:fldCharType="begin"/>
+      </w:r>
+      <w:r>
+        <w:instrText xml:space="preserve"> TOC \h \z \c "Fig 5." </w:instrText>
+      </w:r>
+      <w:r>
+        <w:fldChar w:fldCharType="separate"/>
+      </w:r>
+      <w:hyperlink r:id="rId9" w:anchor="_Toc182659508" w:history="1">
+        <w:r>
+          <w:rPr>
+            <w:rStyle w:val="Hyperlink"/>
+            <w:noProof/>
+          </w:rPr>
+          <w:t>Fig 5.1: Agile Methodology</w:t>
+        </w:r>
+        <w:r>
+          <w:rPr>
+            <w:noProof/>
+            <w:webHidden/>
+          </w:rPr>
+          <w:tab/>
+        </w:r>
+        <w:r>
+          <w:rPr>
+            <w:noProof/>
+            <w:webHidden/>
+          </w:rPr>
+          <w:fldChar w:fldCharType="begin"/>
+        </w:r>
+        <w:r>
+          <w:rPr>
+            <w:noProof/>
+            <w:webHidden/>
+          </w:rPr>
+          <w:instrText xml:space="preserve"> PAGEREF _Toc182659508 \h </w:instrText>
+        </w:r>
+        <w:r>
+          <w:rPr>
+            <w:noProof/>
+            <w:webHidden/>
+          </w:rPr>
+        </w:r>
+        <w:r>
+          <w:rPr>
+            <w:noProof/>
+            <w:webHidden/>
+          </w:rPr>
+          <w:fldChar w:fldCharType="separate"/>
+        </w:r>
+        <w:r>
+          <w:rPr>
+            <w:noProof/>
+            <w:webHidden/>
+          </w:rPr>
+          <w:t>5</w:t>
+        </w:r>
+        <w:r>
+          <w:rPr>
+            <w:noProof/>
+            <w:webHidden/>
+          </w:rPr>
+          <w:fldChar w:fldCharType="end"/>
+        </w:r>
+      </w:hyperlink>
+      <w:r>
+        <w:rPr>
+          <w:noProof/>
+        </w:rPr>
+        <w:fldChar w:fldCharType="end"/>
+      </w:r>
     </w:p>
     <w:p>
       <w:pPr>
@@ -2195,9 +2278,7 @@
           <w:tab w:val="right" w:leader="dot" w:pos="8296"/>
         </w:tabs>
         <w:rPr>
-          <w:rFonts w:asciiTheme="minorHAnsi" w:eastAsiaTheme="minorEastAsia" w:hAnsiTheme="minorHAnsi"/>
           <w:noProof/>
-          <w:sz w:val="22"/>
         </w:rPr>
       </w:pPr>
       <w:hyperlink w:anchor="_Toc186315117" w:history="1">
@@ -2264,6 +2345,86 @@
         <w:tabs>
           <w:tab w:val="right" w:leader="dot" w:pos="8296"/>
         </w:tabs>
+        <w:rPr>
+          <w:noProof/>
+        </w:rPr>
+      </w:pPr>
+      <w:r>
+        <w:fldChar w:fldCharType="end"/>
+      </w:r>
+      <w:r>
+        <w:fldChar w:fldCharType="begin"/>
+      </w:r>
+      <w:r>
+        <w:instrText xml:space="preserve"> TOC \h \z \c "Fig 7." </w:instrText>
+      </w:r>
+      <w:r>
+        <w:fldChar w:fldCharType="separate"/>
+      </w:r>
+      <w:hyperlink w:anchor="_Toc186316253" w:history="1">
+        <w:r>
+          <w:rPr>
+            <w:rStyle w:val="Hyperlink"/>
+            <w:noProof/>
+          </w:rPr>
+          <w:t>Fig 7. 1: Project Gantt Chart</w:t>
+        </w:r>
+        <w:r>
+          <w:rPr>
+            <w:noProof/>
+            <w:webHidden/>
+          </w:rPr>
+          <w:tab/>
+        </w:r>
+        <w:r>
+          <w:rPr>
+            <w:noProof/>
+            <w:webHidden/>
+          </w:rPr>
+          <w:fldChar w:fldCharType="begin"/>
+        </w:r>
+        <w:r>
+          <w:rPr>
+            <w:noProof/>
+            <w:webHidden/>
+          </w:rPr>
+          <w:instrText xml:space="preserve"> PAGEREF _Toc186316253 \h </w:instrText>
+        </w:r>
+        <w:r>
+          <w:rPr>
+            <w:noProof/>
+            <w:webHidden/>
+          </w:rPr>
+        </w:r>
+        <w:r>
+          <w:rPr>
+            <w:noProof/>
+            <w:webHidden/>
+          </w:rPr>
+          <w:fldChar w:fldCharType="separate"/>
+        </w:r>
+        <w:r>
+          <w:rPr>
+            <w:noProof/>
+            <w:webHidden/>
+          </w:rPr>
+          <w:t>8</w:t>
+        </w:r>
+        <w:r>
+          <w:rPr>
+            <w:noProof/>
+            <w:webHidden/>
+          </w:rPr>
+          <w:fldChar w:fldCharType="end"/>
+        </w:r>
+      </w:hyperlink>
+    </w:p>
+    <w:p>
+      <w:pPr>
+        <w:pStyle w:val="TableofFigures"/>
+        <w:tabs>
+          <w:tab w:val="right" w:leader="dot" w:pos="8296"/>
+        </w:tabs>
         <w:sectPr>
           <w:footerReference w:type="default" r:id="rId10"/>
           <w:pgSz w:w="11906" w:h="16838" w:code="9"/>
@@ -2287,12 +2448,12 @@
         </w:numPr>
         <w:ind w:left="360" w:right="0"/>
       </w:pPr>
-      <w:bookmarkStart w:id="6" w:name="_Toc186315217"/>
+      <w:bookmarkStart w:id="7" w:name="_Toc186316280"/>
       <w:r>
         <w:lastRenderedPageBreak/>
         <w:t>Introduction</w:t>
       </w:r>
-      <w:bookmarkEnd w:id="6"/>
+      <w:bookmarkEnd w:id="7"/>
     </w:p>
     <w:p>
       <w:pPr>
@@ -2403,12 +2564,12 @@
         </w:numPr>
         <w:ind w:left="360" w:right="0"/>
       </w:pPr>
-      <w:bookmarkStart w:id="7" w:name="_Toc186315218"/>
+      <w:bookmarkStart w:id="8" w:name="_Toc186316281"/>
       <w:r>
         <w:lastRenderedPageBreak/>
         <w:t>Problem Statement</w:t>
       </w:r>
-      <w:bookmarkEnd w:id="7"/>
+      <w:bookmarkEnd w:id="8"/>
     </w:p>
     <w:p>
       <w:pPr>
@@ -2474,12 +2635,12 @@
         </w:numPr>
         <w:ind w:left="360" w:right="0"/>
       </w:pPr>
-      <w:bookmarkStart w:id="8" w:name="_Toc186315219"/>
+      <w:bookmarkStart w:id="9" w:name="_Toc186316282"/>
       <w:r>
         <w:lastRenderedPageBreak/>
         <w:t>Objectives</w:t>
       </w:r>
-      <w:bookmarkEnd w:id="8"/>
+      <w:bookmarkEnd w:id="9"/>
     </w:p>
     <w:p>
       <w:pPr>
@@ -2574,12 +2735,12 @@
         </w:numPr>
         <w:ind w:left="360" w:right="0"/>
       </w:pPr>
-      <w:bookmarkStart w:id="9" w:name="_Toc186315220"/>
+      <w:bookmarkStart w:id="10" w:name="_Toc186316283"/>
       <w:r>
         <w:lastRenderedPageBreak/>
         <w:t>Background Study</w:t>
       </w:r>
-      <w:bookmarkEnd w:id="9"/>
+      <w:bookmarkEnd w:id="10"/>
     </w:p>
     <w:p>
       <w:pPr>
@@ -2645,7 +2806,7 @@
         </w:numPr>
         <w:ind w:left="360" w:right="0"/>
       </w:pPr>
-      <w:bookmarkStart w:id="10" w:name="_Toc186315221"/>
+      <w:bookmarkStart w:id="11" w:name="_Toc186316284"/>
       <w:r>
         <w:rPr>
           <w:noProof/>
@@ -2702,7 +2863,7 @@
                                 <w:lang w:bidi="ne-NP"/>
                               </w:rPr>
                             </w:pPr>
-                            <w:bookmarkStart w:id="11" w:name="_Toc182659508"/>
+                            <w:bookmarkStart w:id="12" w:name="_Toc182659508"/>
                             <w:r>
                               <w:rPr>
                                 <w:i w:val="0"/>
@@ -2760,7 +2921,7 @@
                               </w:rPr>
                               <w:t>: Agile Methodology</w:t>
                             </w:r>
-                            <w:bookmarkEnd w:id="11"/>
+                            <w:bookmarkEnd w:id="12"/>
                           </w:p>
                         </w:txbxContent>
                       </wps:txbx>
@@ -2799,7 +2960,7 @@
                           <w:lang w:bidi="ne-NP"/>
                         </w:rPr>
                       </w:pPr>
-                      <w:bookmarkStart w:id="12" w:name="_Toc182659508"/>
+                      <w:bookmarkStart w:id="13" w:name="_Toc182659508"/>
                       <w:r>
                         <w:rPr>
                           <w:i w:val="0"/>
@@ -2857,7 +3018,7 @@
                         </w:rPr>
                         <w:t>: Agile Methodology</w:t>
                       </w:r>
-                      <w:bookmarkEnd w:id="12"/>
+                      <w:bookmarkEnd w:id="13"/>
                     </w:p>
                   </w:txbxContent>
                 </v:textbox>
@@ -2937,7 +3098,7 @@
       <w:r>
         <w:t>Methodology</w:t>
       </w:r>
-      <w:bookmarkEnd w:id="10"/>
+      <w:bookmarkEnd w:id="11"/>
       <w:r>
         <w:t xml:space="preserve"> </w:t>
       </w:r>
@@ -3121,7 +3282,7 @@
                                 <w:sz w:val="28"/>
                               </w:rPr>
                             </w:pPr>
-                            <w:bookmarkStart w:id="13" w:name="_Toc182659670"/>
+                            <w:bookmarkStart w:id="14" w:name="_Toc182659670"/>
                             <w:r>
                               <w:rPr>
                                 <w:i w:val="0"/>
@@ -3179,7 +3340,7 @@
                               </w:rPr>
                               <w:t>: Project Gantt Chart</w:t>
                             </w:r>
-                            <w:bookmarkEnd w:id="13"/>
+                            <w:bookmarkEnd w:id="14"/>
                           </w:p>
                         </w:txbxContent>
                       </wps:txbx>
@@ -3211,7 +3372,7 @@
                           <w:sz w:val="28"/>
                         </w:rPr>
                       </w:pPr>
-                      <w:bookmarkStart w:id="14" w:name="_Toc182659670"/>
+                      <w:bookmarkStart w:id="15" w:name="_Toc182659670"/>
                       <w:r>
                         <w:rPr>
                           <w:i w:val="0"/>
@@ -3269,7 +3430,7 @@
                         </w:rPr>
                         <w:t>: Project Gantt Chart</w:t>
                       </w:r>
-                      <w:bookmarkEnd w:id="14"/>
+                      <w:bookmarkEnd w:id="15"/>
                     </w:p>
                   </w:txbxContent>
                 </v:textbox>
@@ -3283,12 +3444,12 @@
       <w:pPr>
         <w:pStyle w:val="Heading1"/>
       </w:pPr>
-      <w:bookmarkStart w:id="15" w:name="_Toc186315222"/>
+      <w:bookmarkStart w:id="16" w:name="_Toc186316285"/>
       <w:r>
         <w:lastRenderedPageBreak/>
         <w:t>6. System Design</w:t>
       </w:r>
-      <w:bookmarkEnd w:id="15"/>
+      <w:bookmarkEnd w:id="16"/>
     </w:p>
     <w:p>
       <w:pPr>
@@ -3298,11 +3459,11 @@
           <w:numId w:val="12"/>
         </w:numPr>
       </w:pPr>
-      <w:bookmarkStart w:id="16" w:name="_Toc186315223"/>
+      <w:bookmarkStart w:id="17" w:name="_Toc186316286"/>
       <w:r>
         <w:t>DFD Level 0</w:t>
       </w:r>
-      <w:bookmarkEnd w:id="16"/>
+      <w:bookmarkEnd w:id="17"/>
     </w:p>
     <w:p>
       <w:pPr>
@@ -3365,9 +3526,9 @@
           <w:sz w:val="20"/>
         </w:rPr>
       </w:pPr>
-      <w:bookmarkStart w:id="17" w:name="_Toc186314941"/>
-      <w:bookmarkStart w:id="18" w:name="_Toc186315024"/>
-      <w:bookmarkStart w:id="19" w:name="_Toc186315115"/>
+      <w:bookmarkStart w:id="18" w:name="_Toc186314941"/>
+      <w:bookmarkStart w:id="19" w:name="_Toc186315024"/>
+      <w:bookmarkStart w:id="20" w:name="_Toc186315115"/>
       <w:r>
         <w:rPr>
           <w:i w:val="0"/>
@@ -3425,9 +3586,9 @@
         </w:rPr>
         <w:t>: DFD Level O</w:t>
       </w:r>
-      <w:bookmarkEnd w:id="17"/>
       <w:bookmarkEnd w:id="18"/>
       <w:bookmarkEnd w:id="19"/>
+      <w:bookmarkEnd w:id="20"/>
     </w:p>
     <w:p/>
     <w:p>
@@ -3438,11 +3599,11 @@
           <w:numId w:val="12"/>
         </w:numPr>
       </w:pPr>
-      <w:bookmarkStart w:id="20" w:name="_Toc186315224"/>
+      <w:bookmarkStart w:id="21" w:name="_Toc186316287"/>
       <w:r>
         <w:t>DFD Level 1</w:t>
       </w:r>
-      <w:bookmarkEnd w:id="20"/>
+      <w:bookmarkEnd w:id="21"/>
     </w:p>
     <w:p>
       <w:pPr>
@@ -3505,8 +3666,8 @@
           <w:sz w:val="20"/>
         </w:rPr>
       </w:pPr>
-      <w:bookmarkStart w:id="21" w:name="_Toc186315025"/>
-      <w:bookmarkStart w:id="22" w:name="_Toc186315116"/>
+      <w:bookmarkStart w:id="22" w:name="_Toc186315025"/>
+      <w:bookmarkStart w:id="23" w:name="_Toc186315116"/>
       <w:r>
         <w:rPr>
           <w:i w:val="0"/>
@@ -3564,8 +3725,8 @@
         </w:rPr>
         <w:t>: DFD Level 1</w:t>
       </w:r>
-      <w:bookmarkEnd w:id="21"/>
       <w:bookmarkEnd w:id="22"/>
+      <w:bookmarkEnd w:id="23"/>
     </w:p>
     <w:p>
       <w:pPr>
@@ -3575,12 +3736,12 @@
           <w:numId w:val="12"/>
         </w:numPr>
       </w:pPr>
-      <w:bookmarkStart w:id="23" w:name="_Toc186315225"/>
+      <w:bookmarkStart w:id="24" w:name="_Toc186316288"/>
       <w:r>
         <w:lastRenderedPageBreak/>
         <w:t>ER Diagram</w:t>
       </w:r>
-      <w:bookmarkEnd w:id="23"/>
+      <w:bookmarkEnd w:id="24"/>
     </w:p>
     <w:p>
       <w:pPr>
@@ -3643,7 +3804,7 @@
           <w:sz w:val="20"/>
         </w:rPr>
       </w:pPr>
-      <w:bookmarkStart w:id="24" w:name="_Toc186315117"/>
+      <w:bookmarkStart w:id="25" w:name="_Toc186315117"/>
       <w:r>
         <w:rPr>
           <w:i w:val="0"/>
@@ -3701,7 +3862,7 @@
         </w:rPr>
         <w:t>: ER Diagram</w:t>
       </w:r>
-      <w:bookmarkEnd w:id="24"/>
+      <w:bookmarkEnd w:id="25"/>
     </w:p>
     <w:p>
       <w:pPr>
@@ -3730,25 +3891,176 @@
       <w:pPr>
         <w:pStyle w:val="Heading1"/>
       </w:pPr>
-      <w:bookmarkStart w:id="25" w:name="_Toc186315226"/>
+      <w:bookmarkStart w:id="26" w:name="_Toc186316289"/>
       <w:r>
         <w:lastRenderedPageBreak/>
         <w:t xml:space="preserve">7. </w:t>
       </w:r>
       <w:r>
+        <w:t>Project Gantt Chart</w:t>
+      </w:r>
+      <w:bookmarkEnd w:id="26"/>
+    </w:p>
+    <w:p>
+      <w:pPr>
+        <w:keepNext/>
+      </w:pPr>
+      <w:r>
+        <w:rPr>
+          <w:noProof/>
+        </w:rPr>
+        <w:drawing>
+          <wp:inline distT="0" distB="0" distL="0" distR="0">
+            <wp:extent cx="5830570" cy="4191000"/>
+            <wp:effectExtent l="0" t="0" r="0" b="0"/>
+            <wp:docPr id="8" name="Picture 8"/>
+            <wp:cNvGraphicFramePr>
+              <a:graphicFrameLocks xmlns:a="http://schemas.openxmlformats.org/drawingml/2006/main" noChangeAspect="1"/>
+            </wp:cNvGraphicFramePr>
+            <a:graphic xmlns:a="http://schemas.openxmlformats.org/drawingml/2006/main">
+              <a:graphicData uri="http://schemas.openxmlformats.org/drawingml/2006/picture">
+                <pic:pic xmlns:pic="http://schemas.openxmlformats.org/drawingml/2006/picture">
+                  <pic:nvPicPr>
+                    <pic:cNvPr id="8" name="Gantt chart.png"/>
+                    <pic:cNvPicPr/>
+                  </pic:nvPicPr>
+                  <pic:blipFill>
+                    <a:blip r:embed="rId15">
+                      <a:extLst>
+                        <a:ext uri="{28A0092B-C50C-407E-A947-70E740481C1C}">
+                          <a14:useLocalDpi xmlns:a14="http://schemas.microsoft.com/office/drawing/2010/main" val="0"/>
+                        </a:ext>
+                      </a:extLst>
+                    </a:blip>
+                    <a:stretch>
+                      <a:fillRect/>
+                    </a:stretch>
+                  </pic:blipFill>
+                  <pic:spPr>
+                    <a:xfrm>
+                      <a:off x="0" y="0"/>
+                      <a:ext cx="5838033" cy="4196364"/>
+                    </a:xfrm>
+                    <a:prstGeom prst="rect">
+                      <a:avLst/>
+                    </a:prstGeom>
+                  </pic:spPr>
+                </pic:pic>
+              </a:graphicData>
+            </a:graphic>
+          </wp:inline>
+        </w:drawing>
+      </w:r>
+    </w:p>
+    <w:p>
+      <w:pPr>
+        <w:pStyle w:val="Caption"/>
+        <w:jc w:val="center"/>
+        <w:rPr>
+          <w:i w:val="0"/>
+          <w:color w:val="auto"/>
+          <w:sz w:val="20"/>
+        </w:rPr>
+      </w:pPr>
+      <w:bookmarkStart w:id="27" w:name="_Toc186316253"/>
+      <w:r>
+        <w:rPr>
+          <w:i w:val="0"/>
+          <w:color w:val="auto"/>
+          <w:sz w:val="20"/>
+        </w:rPr>
+        <w:t xml:space="preserve">Fig 7. </w:t>
+      </w:r>
+      <w:r>
+        <w:rPr>
+          <w:i w:val="0"/>
+          <w:color w:val="auto"/>
+          <w:sz w:val="20"/>
+        </w:rPr>
+        <w:fldChar w:fldCharType="begin"/>
+      </w:r>
+      <w:r>
+        <w:rPr>
+          <w:i w:val="0"/>
+          <w:color w:val="auto"/>
+          <w:sz w:val="20"/>
+        </w:rPr>
+        <w:instrText xml:space="preserve"> SEQ Fig_7. \* ARABIC </w:instrText>
+      </w:r>
+      <w:r>
+        <w:rPr>
+          <w:i w:val="0"/>
+          <w:color w:val="auto"/>
+          <w:sz w:val="20"/>
+        </w:rPr>
+        <w:fldChar w:fldCharType="separate"/>
+      </w:r>
+      <w:r>
+        <w:rPr>
+          <w:i w:val="0"/>
+          <w:noProof/>
+          <w:color w:val="auto"/>
+          <w:sz w:val="20"/>
+        </w:rPr>
+        <w:t>1</w:t>
+      </w:r>
+      <w:r>
+        <w:rPr>
+          <w:i w:val="0"/>
+          <w:color w:val="auto"/>
+          <w:sz w:val="20"/>
+        </w:rPr>
+        <w:fldChar w:fldCharType="end"/>
+      </w:r>
+      <w:r>
+        <w:rPr>
+          <w:i w:val="0"/>
+          <w:color w:val="auto"/>
+          <w:sz w:val="20"/>
+        </w:rPr>
+        <w:t>: Project Gantt Chart</w:t>
+      </w:r>
+      <w:bookmarkEnd w:id="27"/>
+    </w:p>
+    <w:p>
+      <w:pPr>
+        <w:spacing w:line="259" w:lineRule="auto"/>
+        <w:ind w:right="0"/>
+        <w:rPr>
+          <w:rFonts w:eastAsiaTheme="majorEastAsia" w:cstheme="majorBidi"/>
+          <w:b/>
+          <w:color w:val="000000" w:themeColor="text1"/>
+          <w:sz w:val="32"/>
+          <w:szCs w:val="29"/>
+        </w:rPr>
+      </w:pPr>
+      <w:r>
+        <w:br w:type="page"/>
+      </w:r>
+    </w:p>
+    <w:p>
+      <w:pPr>
+        <w:pStyle w:val="Heading1"/>
+      </w:pPr>
+      <w:bookmarkStart w:id="28" w:name="_Toc186316290"/>
+      <w:r>
+        <w:lastRenderedPageBreak/>
+        <w:t xml:space="preserve">8. </w:t>
+      </w:r>
+      <w:r>
         <w:t>Project Progress Report</w:t>
       </w:r>
-      <w:bookmarkEnd w:id="25"/>
+      <w:bookmarkEnd w:id="28"/>
     </w:p>
     <w:p>
       <w:pPr>
         <w:pStyle w:val="Heading3"/>
       </w:pPr>
-      <w:bookmarkStart w:id="26" w:name="_Toc186315227"/>
+      <w:bookmarkStart w:id="29" w:name="_Toc186316291"/>
       <w:r>
         <w:t>Milestones:</w:t>
       </w:r>
-      <w:bookmarkEnd w:id="26"/>
+      <w:bookmarkEnd w:id="29"/>
     </w:p>
     <w:p>
       <w:r>
@@ -3819,11 +4131,11 @@
       <w:pPr>
         <w:pStyle w:val="Heading3"/>
       </w:pPr>
-      <w:bookmarkStart w:id="27" w:name="_Toc186315228"/>
+      <w:bookmarkStart w:id="30" w:name="_Toc186316292"/>
       <w:r>
         <w:t>Tasks Remaining:</w:t>
       </w:r>
-      <w:bookmarkEnd w:id="27"/>
+      <w:bookmarkEnd w:id="30"/>
     </w:p>
     <w:p>
       <w:r>
@@ -3890,12 +4202,15 @@
       <w:r>
         <w:br w:type="page"/>
       </w:r>
-      <w:bookmarkStart w:id="28" w:name="_Toc186315229"/>
+      <w:bookmarkStart w:id="31" w:name="_Toc186316293"/>
       <w:r>
         <w:lastRenderedPageBreak/>
-        <w:t>8. Conclusion</w:t>
-      </w:r>
-      <w:bookmarkEnd w:id="28"/>
+        <w:t>9</w:t>
+      </w:r>
+      <w:r>
+        <w:t>. Conclusion</w:t>
+      </w:r>
+      <w:bookmarkEnd w:id="31"/>
     </w:p>
     <w:p>
       <w:pPr>
@@ -3958,7 +4273,7 @@
         <w:br w:type="page"/>
       </w:r>
     </w:p>
-    <w:bookmarkStart w:id="29" w:name="_Toc186315230" w:displacedByCustomXml="next"/>
+    <w:bookmarkStart w:id="32" w:name="_Toc186316294" w:displacedByCustomXml="next"/>
     <w:sdt>
       <w:sdtPr>
         <w:rPr>
@@ -3984,7 +4299,13 @@
             <w:rPr>
               <w:rFonts w:eastAsiaTheme="minorHAnsi"/>
             </w:rPr>
-            <w:t xml:space="preserve">9. </w:t>
+            <w:t>10</w:t>
+          </w:r>
+          <w:r>
+            <w:rPr>
+              <w:rFonts w:eastAsiaTheme="minorHAnsi"/>
+            </w:rPr>
+            <w:t xml:space="preserve">. </w:t>
           </w:r>
           <w:r>
             <w:rPr>
@@ -3992,7 +4313,7 @@
             </w:rPr>
             <w:t>References</w:t>
           </w:r>
-          <w:bookmarkEnd w:id="29"/>
+          <w:bookmarkEnd w:id="32"/>
         </w:p>
         <w:sdt>
           <w:sdtPr>
@@ -6681,7 +7002,7 @@
 </file>
 
 <file path=customXml/itemProps1.xml><?xml version="1.0" encoding="utf-8"?>
-<ds:datastoreItem xmlns:ds="http://schemas.openxmlformats.org/officeDocument/2006/customXml" ds:itemID="{E239BFEF-7B0B-4E4B-8FFD-E16DB5D82188}">
+<ds:datastoreItem xmlns:ds="http://schemas.openxmlformats.org/officeDocument/2006/customXml" ds:itemID="{0FC4BEF2-EBB2-45EB-A98F-E9AF78A7C690}">
   <ds:schemaRefs>
     <ds:schemaRef ds:uri="http://schemas.openxmlformats.org/officeDocument/2006/bibliography"/>
   </ds:schemaRefs>

</xml_diff>